<commit_message>
Add figure legends, visual QA evidence and round 8a verification report
</commit_message>
<xml_diff>
--- a/analysis/output/manuscript/TRIPOD-LLM.docx
+++ b/analysis/output/manuscript/TRIPOD-LLM.docx
@@ -59,6 +59,7 @@
             <w:pPr>
               <w:pStyle w:val="Normal"/>
               <w:jc w:val="left"/>
+              <w:keepNext/>
               <w:pBdr>
                 <w:bottom w:val="none" w:sz="0" w:space="0" w:color="000000"/>
                 <w:top w:val="none" w:sz="0" w:space="0" w:color="000000"/>
@@ -114,6 +115,7 @@
             <w:pPr>
               <w:pStyle w:val="Normal"/>
               <w:jc w:val="left"/>
+              <w:keepNext/>
               <w:pBdr>
                 <w:bottom w:val="none" w:sz="0" w:space="0" w:color="000000"/>
                 <w:top w:val="none" w:sz="0" w:space="0" w:color="000000"/>
@@ -169,6 +171,7 @@
             <w:pPr>
               <w:pStyle w:val="Normal"/>
               <w:jc w:val="left"/>
+              <w:keepNext/>
               <w:pBdr>
                 <w:bottom w:val="none" w:sz="0" w:space="0" w:color="000000"/>
                 <w:top w:val="none" w:sz="0" w:space="0" w:color="000000"/>
@@ -224,6 +227,7 @@
             <w:pPr>
               <w:pStyle w:val="Normal"/>
               <w:jc w:val="left"/>
+              <w:keepNext/>
               <w:pBdr>
                 <w:bottom w:val="none" w:sz="0" w:space="0" w:color="000000"/>
                 <w:top w:val="none" w:sz="0" w:space="0" w:color="000000"/>
@@ -279,6 +283,7 @@
             <w:pPr>
               <w:pStyle w:val="Normal"/>
               <w:jc w:val="left"/>
+              <w:keepNext/>
               <w:pBdr>
                 <w:bottom w:val="none" w:sz="0" w:space="0" w:color="000000"/>
                 <w:top w:val="none" w:sz="0" w:space="0" w:color="000000"/>
@@ -334,6 +339,7 @@
             <w:pPr>
               <w:pStyle w:val="Normal"/>
               <w:jc w:val="left"/>
+              <w:keepNext/>
               <w:pBdr>
                 <w:bottom w:val="none" w:sz="0" w:space="0" w:color="000000"/>
                 <w:top w:val="none" w:sz="0" w:space="0" w:color="000000"/>
@@ -21563,6 +21569,7 @@
             <w:pPr>
               <w:pStyle w:val="Normal"/>
               <w:jc w:val="left"/>
+              <w:keepNext/>
               <w:pBdr>
                 <w:bottom w:val="none" w:sz="0" w:space="0" w:color="000000"/>
                 <w:top w:val="none" w:sz="0" w:space="0" w:color="000000"/>
@@ -21618,6 +21625,7 @@
             <w:pPr>
               <w:pStyle w:val="Normal"/>
               <w:jc w:val="left"/>
+              <w:keepNext/>
               <w:pBdr>
                 <w:bottom w:val="none" w:sz="0" w:space="0" w:color="000000"/>
                 <w:top w:val="none" w:sz="0" w:space="0" w:color="000000"/>
@@ -21673,6 +21681,7 @@
             <w:pPr>
               <w:pStyle w:val="Normal"/>
               <w:jc w:val="left"/>
+              <w:keepNext/>
               <w:pBdr>
                 <w:bottom w:val="none" w:sz="0" w:space="0" w:color="000000"/>
                 <w:top w:val="none" w:sz="0" w:space="0" w:color="000000"/>
@@ -21728,6 +21737,7 @@
             <w:pPr>
               <w:pStyle w:val="Normal"/>
               <w:jc w:val="left"/>
+              <w:keepNext/>
               <w:pBdr>
                 <w:bottom w:val="none" w:sz="0" w:space="0" w:color="000000"/>
                 <w:top w:val="none" w:sz="0" w:space="0" w:color="000000"/>
@@ -21783,6 +21793,7 @@
             <w:pPr>
               <w:pStyle w:val="Normal"/>
               <w:jc w:val="left"/>
+              <w:keepNext/>
               <w:pBdr>
                 <w:bottom w:val="none" w:sz="0" w:space="0" w:color="000000"/>
                 <w:top w:val="none" w:sz="0" w:space="0" w:color="000000"/>
@@ -21838,6 +21849,7 @@
             <w:pPr>
               <w:pStyle w:val="Normal"/>
               <w:jc w:val="left"/>
+              <w:keepNext/>
               <w:pBdr>
                 <w:bottom w:val="none" w:sz="0" w:space="0" w:color="000000"/>
                 <w:top w:val="none" w:sz="0" w:space="0" w:color="000000"/>

</xml_diff>

<commit_message>
Round 14d: final polish, supplement renumbered in citation order
WP-P (GPT-6.1-Sol), reviewed by orchestrator. Every supplementary item cited
in order; post hoc question separated from the prespecified hypothesis.

Co-Authored-By: Claude Opus 5.5 <noreply@anthropic.com>
</commit_message>
<xml_diff>
--- a/analysis/output/manuscript/TRIPOD-LLM.docx
+++ b/analysis/output/manuscript/TRIPOD-LLM.docx
@@ -1944,7 +1944,7 @@
                 <w:szCs w:val="18"/>
                 <w:color w:val="000000"/>
               </w:rPr>
-              <w:t xml:space="preserve">eMethods Published-label target matching; eTable 1</w:t>
+              <w:t xml:space="preserve">eMethods Published-label target matching; eTable 2</w:t>
             </w:r>
           </w:p>
         </w:tc>
@@ -2225,7 +2225,7 @@
                 <w:szCs w:val="18"/>
                 <w:color w:val="000000"/>
               </w:rPr>
-              <w:t xml:space="preserve">eTable 1; eTable 2</w:t>
+              <w:t xml:space="preserve">eTable 2; eTable 3</w:t>
             </w:r>
           </w:p>
         </w:tc>
@@ -6440,7 +6440,7 @@
                 <w:szCs w:val="18"/>
                 <w:color w:val="000000"/>
               </w:rPr>
-              <w:t xml:space="preserve">Table 2; eTable 17</w:t>
+              <w:t xml:space="preserve">Table 2; eTable 13</w:t>
             </w:r>
           </w:p>
         </w:tc>
@@ -7283,7 +7283,7 @@
                 <w:szCs w:val="18"/>
                 <w:color w:val="000000"/>
               </w:rPr>
-              <w:t xml:space="preserve">Supplement Prompt templates and a filled example; eTable 3</w:t>
+              <w:t xml:space="preserve">Supplement Prompt templates and a filled example; eTable 1</w:t>
             </w:r>
           </w:p>
         </w:tc>
@@ -10936,7 +10936,7 @@
                 <w:szCs w:val="18"/>
                 <w:color w:val="000000"/>
               </w:rPr>
-              <w:t xml:space="preserve">eTables 1–2</w:t>
+              <w:t xml:space="preserve">eTables 2–3</w:t>
             </w:r>
           </w:p>
         </w:tc>
@@ -11217,7 +11217,7 @@
                 <w:szCs w:val="18"/>
                 <w:color w:val="000000"/>
               </w:rPr>
-              <w:t xml:space="preserve">eTable 1; N/A for individual-patient distributions: report-level benchmark</w:t>
+              <w:t xml:space="preserve">eTable 2; N/A for individual-patient distributions: report-level benchmark</w:t>
             </w:r>
           </w:p>
         </w:tc>
@@ -14870,7 +14870,7 @@
                 <w:szCs w:val="18"/>
                 <w:color w:val="000000"/>
               </w:rPr>
-              <w:t xml:space="preserve">eTable 1; Figure 3</w:t>
+              <w:t xml:space="preserve">eTable 2; Figure 3</w:t>
             </w:r>
           </w:p>
         </w:tc>
@@ -15994,7 +15994,7 @@
                 <w:szCs w:val="18"/>
                 <w:color w:val="000000"/>
               </w:rPr>
-              <w:t xml:space="preserve">eTable 1; benchmark README-FOR-ALI.md</w:t>
+              <w:t xml:space="preserve">eTable 2; benchmark README-FOR-ALI.md</w:t>
             </w:r>
           </w:p>
         </w:tc>
@@ -17399,7 +17399,7 @@
                 <w:szCs w:val="18"/>
                 <w:color w:val="000000"/>
               </w:rPr>
-              <w:t xml:space="preserve">eTable 1; Manuscript Methods rater credentials (author completion required)</w:t>
+              <w:t xml:space="preserve">eTable 2; Manuscript Methods rater credentials (author completion required)</w:t>
             </w:r>
           </w:p>
         </w:tc>

</xml_diff>

<commit_message>
Round 15 WP-M/WP-P: manuscript on full-coverage expert reference
- Manuscript rewritten around the blinded dual-expert reference: primary
  53/60 agreed choices; independent agreement on 510 cells with published
  labels as a third source; rules-only recomputation lowers Unassisted
  agreement; revised limitations
- Main displays renumbered in first-citation order (Fig 4<->5; Tables
  2->1, 3->2, 1->3) and propagated to all outputs and HTML reports
- Citation-order assertion added to verify-numbers.py

Co-Authored-By: Claude Opus 5.5 <noreply@anthropic.com>
</commit_message>
<xml_diff>
--- a/analysis/output/manuscript/TRIPOD-LLM.docx
+++ b/analysis/output/manuscript/TRIPOD-LLM.docx
@@ -3060,7 +3060,7 @@
                 <w:szCs w:val="18"/>
                 <w:color w:val="000000"/>
               </w:rPr>
-              <w:t xml:space="preserve">eMethods Independent reference and Overall; Table 3</w:t>
+              <w:t xml:space="preserve">eMethods Independent reference and Overall; Table 2</w:t>
             </w:r>
           </w:p>
         </w:tc>
@@ -5061,7 +5061,7 @@
                 <w:szCs w:val="18"/>
                 <w:color w:val="000000"/>
               </w:rPr>
-              <w:t xml:space="preserve">Table 3; eMethods Evidence binding and verification</w:t>
+              <w:t xml:space="preserve">Table 2; eMethods Evidence binding and verification</w:t>
             </w:r>
           </w:p>
         </w:tc>
@@ -6185,7 +6185,7 @@
                 <w:szCs w:val="18"/>
                 <w:color w:val="000000"/>
               </w:rPr>
-              <w:t xml:space="preserve">eMethods Input parity and label targets; prompt templates; Table 1</w:t>
+              <w:t xml:space="preserve">eMethods Input parity and label targets; prompt templates; Table 3</w:t>
             </w:r>
           </w:p>
         </w:tc>
@@ -6747,7 +6747,7 @@
                 <w:szCs w:val="18"/>
                 <w:color w:val="000000"/>
               </w:rPr>
-              <w:t xml:space="preserve">Table 2; eTable 2 Full independent agreement and paired contrasts; eTable 8 Expert reliability</w:t>
+              <w:t xml:space="preserve">Table 1; eTable 2 Full independent agreement and paired contrasts; eTable 8 Expert reliability</w:t>
             </w:r>
           </w:p>
         </w:tc>
@@ -14402,7 +14402,7 @@
                 <w:szCs w:val="18"/>
                 <w:color w:val="000000"/>
               </w:rPr>
-              <w:t xml:space="preserve">Table 3; eMethods Algorithms and validation; Design status and limitations</w:t>
+              <w:t xml:space="preserve">Table 2; eMethods Algorithms and validation; Design status and limitations</w:t>
             </w:r>
           </w:p>
         </w:tc>
@@ -17493,7 +17493,7 @@
                 <w:szCs w:val="18"/>
                 <w:color w:val="000000"/>
               </w:rPr>
-              <w:t xml:space="preserve">Table 2; eMethods Blinded expert assessment</w:t>
+              <w:t xml:space="preserve">Table 1; eMethods Blinded expert assessment</w:t>
             </w:r>
           </w:p>
         </w:tc>
@@ -18055,7 +18055,7 @@
                 <w:szCs w:val="18"/>
                 <w:color w:val="000000"/>
               </w:rPr>
-              <w:t xml:space="preserve">Figure 3; Table 2</w:t>
+              <w:t xml:space="preserve">Figure 3; Table 1</w:t>
             </w:r>
           </w:p>
         </w:tc>

</xml_diff>

<commit_message>
Remove IMRaD draft and retain analysis materials
</commit_message>
<xml_diff>
--- a/analysis/output/manuscript/TRIPOD-LLM.docx
+++ b/analysis/output/manuscript/TRIPOD-LLM.docx
@@ -313,7 +313,7 @@
                 <w:rFonts w:ascii="Arial" w:hAnsi="Arial"/>
                 <w:sz w:val="20"/>
               </w:rPr>
-              <w:t xml:space="default">Manuscript title</w:t>
+              <w:t xml:space="default">Pending manuscript title</w:t>
             </w:r>
           </w:p>
         </w:tc>
@@ -343,7 +343,7 @@
                 <w:rFonts w:ascii="Arial" w:hAnsi="Arial"/>
                 <w:sz w:val="20"/>
               </w:rPr>
-              <w:t xml:space="default">Reported at the named section or display</w:t>
+              <w:t xml:space="default">Partial or pending; see retained materials and author-completion notes</w:t>
             </w:r>
           </w:p>
         </w:tc>
@@ -468,7 +468,7 @@
                 <w:rFonts w:ascii="Arial" w:hAnsi="Arial"/>
                 <w:sz w:val="20"/>
               </w:rPr>
-              <w:t xml:space="default">Manuscript abstract</w:t>
+              <w:t xml:space="default">Pending manuscript abstract</w:t>
             </w:r>
           </w:p>
         </w:tc>
@@ -498,7 +498,7 @@
                 <w:rFonts w:ascii="Arial" w:hAnsi="Arial"/>
                 <w:sz w:val="20"/>
               </w:rPr>
-              <w:t xml:space="default">Reported at the named section or display</w:t>
+              <w:t xml:space="default">Partial or pending; see retained materials and author-completion notes</w:t>
             </w:r>
           </w:p>
         </w:tc>
@@ -623,7 +623,7 @@
                 <w:rFonts w:ascii="Arial" w:hAnsi="Arial"/>
                 <w:sz w:val="20"/>
               </w:rPr>
-              <w:t xml:space="default">Manuscript Background and significance</w:t>
+              <w:t xml:space="default">Pending manuscript background</w:t>
             </w:r>
           </w:p>
         </w:tc>
@@ -653,7 +653,7 @@
                 <w:rFonts w:ascii="Arial" w:hAnsi="Arial"/>
                 <w:sz w:val="20"/>
               </w:rPr>
-              <w:t xml:space="default">Reported at the named section or display</w:t>
+              <w:t xml:space="default">Partial or pending; see retained materials and author-completion notes</w:t>
             </w:r>
           </w:p>
         </w:tc>
@@ -778,7 +778,7 @@
                 <w:rFonts w:ascii="Arial" w:hAnsi="Arial"/>
                 <w:sz w:val="20"/>
               </w:rPr>
-              <w:t xml:space="default">Manuscript Objective and Discussion</w:t>
+              <w:t xml:space="default">Pending manuscript objectives and discussion</w:t>
             </w:r>
           </w:p>
         </w:tc>
@@ -808,7 +808,7 @@
                 <w:rFonts w:ascii="Arial" w:hAnsi="Arial"/>
                 <w:sz w:val="20"/>
               </w:rPr>
-              <w:t xml:space="default">Reported at the named section or display</w:t>
+              <w:t xml:space="default">Partial or pending; see retained materials and author-completion notes</w:t>
             </w:r>
           </w:p>
         </w:tc>
@@ -933,7 +933,7 @@
                 <w:rFonts w:ascii="Arial" w:hAnsi="Arial"/>
                 <w:sz w:val="20"/>
               </w:rPr>
-              <w:t xml:space="default">Manuscript Objective</w:t>
+              <w:t xml:space="default">Pending manuscript objectives</w:t>
             </w:r>
           </w:p>
         </w:tc>
@@ -963,7 +963,7 @@
                 <w:rFonts w:ascii="Arial" w:hAnsi="Arial"/>
                 <w:sz w:val="20"/>
               </w:rPr>
-              <w:t xml:space="default">Reported at the named section or display</w:t>
+              <w:t xml:space="default">Partial or pending; see retained materials and author-completion notes</w:t>
             </w:r>
           </w:p>
         </w:tc>
@@ -1428,7 +1428,7 @@
                 <w:rFonts w:ascii="Arial" w:hAnsi="Arial"/>
                 <w:sz w:val="20"/>
               </w:rPr>
-              <w:t xml:space="default">Partial; author information remains pending</w:t>
+              <w:t xml:space="default">Partial or pending; see retained materials and author-completion notes</w:t>
             </w:r>
           </w:p>
         </w:tc>
@@ -1463,7 +1463,7 @@
                 <w:rFonts w:ascii="Arial" w:hAnsi="Arial"/>
                 <w:sz w:val="20"/>
               </w:rPr>
-              <w:t xml:space="default">Author credentials, declarations, text-date coverage and archive details require author completion. Current section titles and display numbers identify reported material.</w:t>
+              <w:t xml:space="default">The previous IMRaD draft was removed for a fresh manuscript. Pending manuscript sections, author credentials, declarations, text-date coverage and archive details require completion. Other locators identify retained analysis and supplement materials.</w:t>
             </w:r>
           </w:p>
         </w:tc>
@@ -2281,7 +2281,7 @@
                 <w:rFonts w:ascii="Arial" w:hAnsi="Arial"/>
                 <w:sz w:val="20"/>
               </w:rPr>
-              <w:t xml:space="default">Partial; author information remains pending</w:t>
+              <w:t xml:space="default">Partial or pending; see retained materials and author-completion notes</w:t>
             </w:r>
           </w:p>
         </w:tc>
@@ -2936,7 +2936,7 @@
                 <w:rFonts w:ascii="Arial" w:hAnsi="Arial"/>
                 <w:sz w:val="20"/>
               </w:rPr>
-              <w:t xml:space="default">Author credentials, declarations, text-date coverage and archive details require author completion. Current section titles and display numbers identify reported material.</w:t>
+              <w:t xml:space="default">The previous IMRaD draft was removed for a fresh manuscript. Pending manuscript sections, author credentials, declarations, text-date coverage and archive details require completion. Other locators identify retained analysis and supplement materials.</w:t>
             </w:r>
           </w:p>
         </w:tc>
@@ -3569,7 +3569,7 @@
                 <w:rFonts w:ascii="Arial" w:hAnsi="Arial"/>
                 <w:sz w:val="20"/>
               </w:rPr>
-              <w:t xml:space="default">Manuscript Independent human reviews; eMethods Blinded human assessment; individual credentials require author information</w:t>
+              <w:t xml:space="default">eMethods Blinded human assessment; individual credentials require author information</w:t>
             </w:r>
           </w:p>
         </w:tc>
@@ -3599,7 +3599,7 @@
                 <w:rFonts w:ascii="Arial" w:hAnsi="Arial"/>
                 <w:sz w:val="20"/>
               </w:rPr>
-              <w:t xml:space="default">Partial; author information remains pending</w:t>
+              <w:t xml:space="default">Partial or pending; see retained materials and author-completion notes</w:t>
             </w:r>
           </w:p>
         </w:tc>
@@ -3724,7 +3724,7 @@
                 <w:rFonts w:ascii="Arial" w:hAnsi="Arial"/>
                 <w:sz w:val="20"/>
               </w:rPr>
-              <w:t xml:space="default">Manuscript Benchmark and assessment arms; Prompt templates and run provenance</w:t>
+              <w:t xml:space="default">eMethods Benchmark and supplied inputs; Prompt templates and run provenance</w:t>
             </w:r>
           </w:p>
         </w:tc>
@@ -3909,7 +3909,7 @@
                 <w:rFonts w:ascii="Arial" w:hAnsi="Arial"/>
                 <w:sz w:val="20"/>
               </w:rPr>
-              <w:t xml:space="default">Partial; author information remains pending</w:t>
+              <w:t xml:space="default">Partial or pending; see retained materials and author-completion notes</w:t>
             </w:r>
           </w:p>
         </w:tc>
@@ -4189,7 +4189,7 @@
                 <w:rFonts w:ascii="Arial" w:hAnsi="Arial"/>
                 <w:sz w:val="20"/>
               </w:rPr>
-              <w:t xml:space="default">Manuscript Independent human reviews; individual experience/calibration require author information</w:t>
+              <w:t xml:space="default">eMethods Blinded human assessment; individual experience/calibration require author information</w:t>
             </w:r>
           </w:p>
         </w:tc>
@@ -4219,7 +4219,7 @@
                 <w:rFonts w:ascii="Arial" w:hAnsi="Arial"/>
                 <w:sz w:val="20"/>
               </w:rPr>
-              <w:t xml:space="default">Partial; author information remains pending</w:t>
+              <w:t xml:space="default">Partial or pending; see retained materials and author-completion notes</w:t>
             </w:r>
           </w:p>
         </w:tc>
@@ -4374,7 +4374,7 @@
                 <w:rFonts w:ascii="Arial" w:hAnsi="Arial"/>
                 <w:sz w:val="20"/>
               </w:rPr>
-              <w:t xml:space="default">Partial; author information remains pending</w:t>
+              <w:t xml:space="default">Partial or pending; see retained materials and author-completion notes</w:t>
             </w:r>
           </w:p>
         </w:tc>
@@ -4409,7 +4409,7 @@
                 <w:rFonts w:ascii="Arial" w:hAnsi="Arial"/>
                 <w:sz w:val="20"/>
               </w:rPr>
-              <w:t xml:space="default">Author credentials, declarations, text-date coverage and archive details require author completion. Current section titles and display numbers identify reported material.</w:t>
+              <w:t xml:space="default">The previous IMRaD draft was removed for a fresh manuscript. Pending manuscript sections, author credentials, declarations, text-date coverage and archive details require completion. Other locators identify retained analysis and supplement materials.</w:t>
             </w:r>
           </w:p>
         </w:tc>
@@ -5352,7 +5352,7 @@
                 <w:rFonts w:ascii="Arial" w:hAnsi="Arial"/>
                 <w:sz w:val="20"/>
               </w:rPr>
-              <w:t xml:space="default">Manuscript Ethics declaration; author confirmation required</w:t>
+              <w:t xml:space="default">Pending manuscript ethics declaration; author confirmation required</w:t>
             </w:r>
           </w:p>
         </w:tc>
@@ -5382,7 +5382,7 @@
                 <w:rFonts w:ascii="Arial" w:hAnsi="Arial"/>
                 <w:sz w:val="20"/>
               </w:rPr>
-              <w:t xml:space="default">Partial; author information remains pending</w:t>
+              <w:t xml:space="default">Partial or pending; see retained materials and author-completion notes</w:t>
             </w:r>
           </w:p>
         </w:tc>
@@ -5507,7 +5507,7 @@
                 <w:rFonts w:ascii="Arial" w:hAnsi="Arial"/>
                 <w:sz w:val="20"/>
               </w:rPr>
-              <w:t xml:space="default">Manuscript Funding; author confirmation required</w:t>
+              <w:t xml:space="default">Pending manuscript funding statement; author confirmation required</w:t>
             </w:r>
           </w:p>
         </w:tc>
@@ -5537,7 +5537,7 @@
                 <w:rFonts w:ascii="Arial" w:hAnsi="Arial"/>
                 <w:sz w:val="20"/>
               </w:rPr>
-              <w:t xml:space="default">Partial; author information remains pending</w:t>
+              <w:t xml:space="default">Partial or pending; see retained materials and author-completion notes</w:t>
             </w:r>
           </w:p>
         </w:tc>
@@ -5662,7 +5662,7 @@
                 <w:rFonts w:ascii="Arial" w:hAnsi="Arial"/>
                 <w:sz w:val="20"/>
               </w:rPr>
-              <w:t xml:space="default">Manuscript Competing interests; author confirmation required</w:t>
+              <w:t xml:space="default">Pending manuscript competing interests; author confirmation required</w:t>
             </w:r>
           </w:p>
         </w:tc>
@@ -5692,7 +5692,7 @@
                 <w:rFonts w:ascii="Arial" w:hAnsi="Arial"/>
                 <w:sz w:val="20"/>
               </w:rPr>
-              <w:t xml:space="default">Partial; author information remains pending</w:t>
+              <w:t xml:space="default">Partial or pending; see retained materials and author-completion notes</w:t>
             </w:r>
           </w:p>
         </w:tc>
@@ -5847,7 +5847,7 @@
                 <w:rFonts w:ascii="Arial" w:hAnsi="Arial"/>
                 <w:sz w:val="20"/>
               </w:rPr>
-              <w:t xml:space="default">Partial; author information remains pending</w:t>
+              <w:t xml:space="default">Partial or pending; see retained materials and author-completion notes</w:t>
             </w:r>
           </w:p>
         </w:tc>
@@ -5882,7 +5882,7 @@
                 <w:rFonts w:ascii="Arial" w:hAnsi="Arial"/>
                 <w:sz w:val="20"/>
               </w:rPr>
-              <w:t xml:space="default">Author credentials, declarations, text-date coverage and archive details require author completion. Current section titles and display numbers identify reported material.</w:t>
+              <w:t xml:space="default">The previous IMRaD draft was removed for a fresh manuscript. Pending manuscript sections, author credentials, declarations, text-date coverage and archive details require completion. Other locators identify retained analysis and supplement materials.</w:t>
             </w:r>
           </w:p>
         </w:tc>
@@ -6205,7 +6205,7 @@
                 <w:rFonts w:ascii="Arial" w:hAnsi="Arial"/>
                 <w:sz w:val="20"/>
               </w:rPr>
-              <w:t xml:space="default">Manuscript Ethics, registration and public involvement; author confirmation required</w:t>
+              <w:t xml:space="default">Pending manuscript registration statement; author confirmation required</w:t>
             </w:r>
           </w:p>
         </w:tc>
@@ -6235,7 +6235,7 @@
                 <w:rFonts w:ascii="Arial" w:hAnsi="Arial"/>
                 <w:sz w:val="20"/>
               </w:rPr>
-              <w:t xml:space="default">Partial; author information remains pending</w:t>
+              <w:t xml:space="default">Partial or pending; see retained materials and author-completion notes</w:t>
             </w:r>
           </w:p>
         </w:tc>
@@ -6360,7 +6360,7 @@
                 <w:rFonts w:ascii="Arial" w:hAnsi="Arial"/>
                 <w:sz w:val="20"/>
               </w:rPr>
-              <w:t xml:space="default">Manuscript Data availability; Linked source records and reproducibility materials</w:t>
+              <w:t xml:space="default">Linked source records and reproducibility materials; pending manuscript data availability statement</w:t>
             </w:r>
           </w:p>
         </w:tc>
@@ -6390,7 +6390,7 @@
                 <w:rFonts w:ascii="Arial" w:hAnsi="Arial"/>
                 <w:sz w:val="20"/>
               </w:rPr>
-              <w:t xml:space="default">Reported at the named section or display</w:t>
+              <w:t xml:space="default">Partial or pending; see retained materials and author-completion notes</w:t>
             </w:r>
           </w:p>
         </w:tc>
@@ -6515,7 +6515,7 @@
                 <w:rFonts w:ascii="Arial" w:hAnsi="Arial"/>
                 <w:sz w:val="20"/>
               </w:rPr>
-              <w:t xml:space="default">Manuscript Data availability; Prompt templates and run provenance</w:t>
+              <w:t xml:space="default">Prompt templates and run provenance; pending manuscript code availability statement</w:t>
             </w:r>
           </w:p>
         </w:tc>
@@ -6545,7 +6545,7 @@
                 <w:rFonts w:ascii="Arial" w:hAnsi="Arial"/>
                 <w:sz w:val="20"/>
               </w:rPr>
-              <w:t xml:space="default">Reported at the named section or display</w:t>
+              <w:t xml:space="default">Partial or pending; see retained materials and author-completion notes</w:t>
             </w:r>
           </w:p>
         </w:tc>
@@ -6670,7 +6670,7 @@
                 <w:rFonts w:ascii="Arial" w:hAnsi="Arial"/>
                 <w:sz w:val="20"/>
               </w:rPr>
-              <w:t xml:space="default">Manuscript Public involvement statement; author confirmation required</w:t>
+              <w:t xml:space="default">Pending manuscript public involvement statement; author confirmation required</w:t>
             </w:r>
           </w:p>
         </w:tc>
@@ -6700,7 +6700,7 @@
                 <w:rFonts w:ascii="Arial" w:hAnsi="Arial"/>
                 <w:sz w:val="20"/>
               </w:rPr>
-              <w:t xml:space="default">Partial; author information remains pending</w:t>
+              <w:t xml:space="default">Partial or pending; see retained materials and author-completion notes</w:t>
             </w:r>
           </w:p>
         </w:tc>
@@ -7355,7 +7355,7 @@
                 <w:rFonts w:ascii="Arial" w:hAnsi="Arial"/>
                 <w:sz w:val="20"/>
               </w:rPr>
-              <w:t xml:space="default">Author credentials, declarations, text-date coverage and archive details require author completion. Current section titles and display numbers identify reported material.</w:t>
+              <w:t xml:space="default">The previous IMRaD draft was removed for a fresh manuscript. Pending manuscript sections, author credentials, declarations, text-date coverage and archive details require completion. Other locators identify retained analysis and supplement materials.</w:t>
             </w:r>
           </w:p>
         </w:tc>
@@ -7988,7 +7988,7 @@
                 <w:rFonts w:ascii="Arial" w:hAnsi="Arial"/>
                 <w:sz w:val="20"/>
               </w:rPr>
-              <w:t xml:space="default">Manuscript Discussion</w:t>
+              <w:t xml:space="default">Pending manuscript discussion</w:t>
             </w:r>
           </w:p>
         </w:tc>
@@ -8018,7 +8018,7 @@
                 <w:rFonts w:ascii="Arial" w:hAnsi="Arial"/>
                 <w:sz w:val="20"/>
               </w:rPr>
-              <w:t xml:space="default">Reported at the named section or display</w:t>
+              <w:t xml:space="default">Partial or pending; see retained materials and author-completion notes</w:t>
             </w:r>
           </w:p>
         </w:tc>
@@ -8143,7 +8143,7 @@
                 <w:rFonts w:ascii="Arial" w:hAnsi="Arial"/>
                 <w:sz w:val="20"/>
               </w:rPr>
-              <w:t xml:space="default">Manuscript Discussion; eMethods Inference</w:t>
+              <w:t xml:space="default">eMethods Inference; pending manuscript limitations</w:t>
             </w:r>
           </w:p>
         </w:tc>
@@ -8173,7 +8173,7 @@
                 <w:rFonts w:ascii="Arial" w:hAnsi="Arial"/>
                 <w:sz w:val="20"/>
               </w:rPr>
-              <w:t xml:space="default">Reported at the named section or display</w:t>
+              <w:t xml:space="default">Partial or pending; see retained materials and author-completion notes</w:t>
             </w:r>
           </w:p>
         </w:tc>
@@ -8453,7 +8453,7 @@
                 <w:rFonts w:ascii="Arial" w:hAnsi="Arial"/>
                 <w:sz w:val="20"/>
               </w:rPr>
-              <w:t xml:space="default">Manuscript Discussion</w:t>
+              <w:t xml:space="default">Pending manuscript discussion</w:t>
             </w:r>
           </w:p>
         </w:tc>
@@ -8483,7 +8483,7 @@
                 <w:rFonts w:ascii="Arial" w:hAnsi="Arial"/>
                 <w:sz w:val="20"/>
               </w:rPr>
-              <w:t xml:space="default">Reported at the named section or display</w:t>
+              <w:t xml:space="default">Partial or pending; see retained materials and author-completion notes</w:t>
             </w:r>
           </w:p>
         </w:tc>
@@ -8763,7 +8763,7 @@
                 <w:rFonts w:ascii="Arial" w:hAnsi="Arial"/>
                 <w:sz w:val="20"/>
               </w:rPr>
-              <w:t xml:space="default">Manuscript Discussion</w:t>
+              <w:t xml:space="default">Pending manuscript discussion</w:t>
             </w:r>
           </w:p>
         </w:tc>
@@ -8793,7 +8793,7 @@
                 <w:rFonts w:ascii="Arial" w:hAnsi="Arial"/>
                 <w:sz w:val="20"/>
               </w:rPr>
-              <w:t xml:space="default">Reported at the named section or display</w:t>
+              <w:t xml:space="default">Partial or pending; see retained materials and author-completion notes</w:t>
             </w:r>
           </w:p>
         </w:tc>
@@ -8828,7 +8828,7 @@
                 <w:rFonts w:ascii="Arial" w:hAnsi="Arial"/>
                 <w:sz w:val="20"/>
               </w:rPr>
-              <w:t xml:space="default">Author credentials, declarations, text-date coverage and archive details require author completion. Current section titles and display numbers identify reported material.</w:t>
+              <w:t xml:space="default">The previous IMRaD draft was removed for a fresh manuscript. Pending manuscript sections, author credentials, declarations, text-date coverage and archive details require completion. Other locators identify retained analysis and supplement materials.</w:t>
             </w:r>
           </w:p>
         </w:tc>
@@ -9151,7 +9151,7 @@
                 <w:rFonts w:ascii="Arial" w:hAnsi="Arial"/>
                 <w:sz w:val="20"/>
               </w:rPr>
-              <w:t xml:space="default">Manuscript Discussion</w:t>
+              <w:t xml:space="default">Pending manuscript discussion</w:t>
             </w:r>
           </w:p>
         </w:tc>
@@ -9181,7 +9181,7 @@
                 <w:rFonts w:ascii="Arial" w:hAnsi="Arial"/>
                 <w:sz w:val="20"/>
               </w:rPr>
-              <w:t xml:space="default">Reported at the named section or display</w:t>
+              <w:t xml:space="default">Partial or pending; see retained materials and author-completion notes</w:t>
             </w:r>
           </w:p>
         </w:tc>
@@ -9306,7 +9306,7 @@
                 <w:rFonts w:ascii="Arial" w:hAnsi="Arial"/>
                 <w:sz w:val="20"/>
               </w:rPr>
-              <w:t xml:space="default">Manuscript title and abstract</w:t>
+              <w:t xml:space="default">Pending manuscript title and abstract</w:t>
             </w:r>
           </w:p>
         </w:tc>
@@ -9336,7 +9336,7 @@
                 <w:rFonts w:ascii="Arial" w:hAnsi="Arial"/>
                 <w:sz w:val="20"/>
               </w:rPr>
-              <w:t xml:space="default">Reported at the named section or display</w:t>
+              <w:t xml:space="default">Partial or pending; see retained materials and author-completion notes</w:t>
             </w:r>
           </w:p>
         </w:tc>
@@ -9771,7 +9771,7 @@
                 <w:rFonts w:ascii="Arial" w:hAnsi="Arial"/>
                 <w:sz w:val="20"/>
               </w:rPr>
-              <w:t xml:space="default">Manuscript Independent human reviews; individual credentials require author information</w:t>
+              <w:t xml:space="default">eMethods Blinded human assessment; individual credentials require author information</w:t>
             </w:r>
           </w:p>
         </w:tc>
@@ -9801,7 +9801,7 @@
                 <w:rFonts w:ascii="Arial" w:hAnsi="Arial"/>
                 <w:sz w:val="20"/>
               </w:rPr>
-              <w:t xml:space="default">Partial; author information remains pending</w:t>
+              <w:t xml:space="default">Partial or pending; see retained materials and author-completion notes</w:t>
             </w:r>
           </w:p>
         </w:tc>
@@ -9926,7 +9926,7 @@
                 <w:rFonts w:ascii="Arial" w:hAnsi="Arial"/>
                 <w:sz w:val="20"/>
               </w:rPr>
-              <w:t xml:space="default">Manuscript Objective</w:t>
+              <w:t xml:space="default">Pending manuscript objectives</w:t>
             </w:r>
           </w:p>
         </w:tc>
@@ -9956,7 +9956,7 @@
                 <w:rFonts w:ascii="Arial" w:hAnsi="Arial"/>
                 <w:sz w:val="20"/>
               </w:rPr>
-              <w:t xml:space="default">Reported at the named section or display</w:t>
+              <w:t xml:space="default">Partial or pending; see retained materials and author-completion notes</w:t>
             </w:r>
           </w:p>
         </w:tc>
@@ -10266,7 +10266,7 @@
                 <w:rFonts w:ascii="Arial" w:hAnsi="Arial"/>
                 <w:sz w:val="20"/>
               </w:rPr>
-              <w:t xml:space="default">Partial; author information remains pending</w:t>
+              <w:t xml:space="default">Partial or pending; see retained materials and author-completion notes</w:t>
             </w:r>
           </w:p>
         </w:tc>
@@ -10301,7 +10301,7 @@
                 <w:rFonts w:ascii="Arial" w:hAnsi="Arial"/>
                 <w:sz w:val="20"/>
               </w:rPr>
-              <w:t xml:space="default">Author credentials, declarations, text-date coverage and archive details require author completion. Current section titles and display numbers identify reported material.</w:t>
+              <w:t xml:space="default">The previous IMRaD draft was removed for a fresh manuscript. Pending manuscript sections, author credentials, declarations, text-date coverage and archive details require completion. Other locators identify retained analysis and supplement materials.</w:t>
             </w:r>
           </w:p>
         </w:tc>
@@ -11244,7 +11244,7 @@
                 <w:rFonts w:ascii="Arial" w:hAnsi="Arial"/>
                 <w:sz w:val="20"/>
               </w:rPr>
-              <w:t xml:space="default">Table 1; Manuscript Independent human reviews</w:t>
+              <w:t xml:space="default">Table 1; eMethods Blinded human assessment</w:t>
             </w:r>
           </w:p>
         </w:tc>
@@ -11554,7 +11554,7 @@
                 <w:rFonts w:ascii="Arial" w:hAnsi="Arial"/>
                 <w:sz w:val="20"/>
               </w:rPr>
-              <w:t xml:space="default">Manuscript Discussion</w:t>
+              <w:t xml:space="default">Pending manuscript discussion</w:t>
             </w:r>
           </w:p>
         </w:tc>
@@ -11584,7 +11584,7 @@
                 <w:rFonts w:ascii="Arial" w:hAnsi="Arial"/>
                 <w:sz w:val="20"/>
               </w:rPr>
-              <w:t xml:space="default">Reported at the named section or display</w:t>
+              <w:t xml:space="default">Partial or pending; see retained materials and author-completion notes</w:t>
             </w:r>
           </w:p>
         </w:tc>
@@ -11774,7 +11774,7 @@
                 <w:rFonts w:ascii="Arial" w:hAnsi="Arial"/>
                 <w:sz w:val="20"/>
               </w:rPr>
-              <w:t xml:space="default">Author credentials, declarations, text-date coverage and archive details require author completion. Current section titles and display numbers identify reported material.</w:t>
+              <w:t xml:space="default">The previous IMRaD draft was removed for a fresh manuscript. Pending manuscript sections, author credentials, declarations, text-date coverage and archive details require completion. Other locators identify retained analysis and supplement materials.</w:t>
             </w:r>
           </w:p>
         </w:tc>

</xml_diff>